<commit_message>
Kit synced: step card 4 points to the sample course online; share page copy in the new frame
Co-Authored-By: Claude Opus 5.5 <noreply@anthropic.com>
</commit_message>
<xml_diff>
--- a/kit/step-cards/4-ground-it.docx
+++ b/kit/step-cards/4-ground-it.docx
@@ -95,6 +95,14 @@
       </w:pPr>
       <w:r>
         <w:t>Optional: open the syllabus in Word, choose Review, then Check Accessibility, and paste the results into Copilot Chat with your agent. Same skill, different checker.</w:t>
+      </w:r>
+    </w:p>
+    <w:p>
+      <w:pPr>
+        <w:pStyle w:val="ListNumber"/>
+      </w:pPr>
+      <w:r>
+        <w:t>Optional: the course announcement is online at letitglow.app/ahg/site. Run Accessibility Insights FastPass on it and compare with its checker report.</w:t>
       </w:r>
     </w:p>
     <w:p>

</xml_diff>